<commit_message>
Fix broken commands in the instuctions S1, S2, S3 and added new rviz configs
</commit_message>
<xml_diff>
--- a/docs/Короткие_инструкции/docx/S1_Как_запустить_симуляцию.docx
+++ b/docs/Короткие_инструкции/docx/S1_Как_запустить_симуляцию.docx
@@ -214,12 +214,27 @@
           <w:rFonts w:hint="default"/>
           <w:lang w:val="ru-RU"/>
         </w:rPr>
-        <w:t>Компьютер с Ubuntu 22.04 и ROS2.</w:t>
+        <w:t xml:space="preserve">Компьютер с Ubuntu 22.04 и ROS2 </w:t>
+      </w:r>
+      <w:r>
+        <w:rPr>
+          <w:rFonts w:hint="default"/>
+          <w:lang w:val="en-US"/>
+        </w:rPr>
+        <w:t>Humble</w:t>
+      </w:r>
+      <w:r>
+        <w:rPr>
+          <w:rFonts w:hint="default"/>
+          <w:lang w:val="ru-RU"/>
+        </w:rPr>
+        <w:t>.</w:t>
       </w:r>
     </w:p>
     <w:p>
       <w:pPr>
         <w:numPr>
+          <w:ilvl w:val="0"/>
           <w:numId w:val="0"/>
         </w:numPr>
         <w:jc w:val="both"/>
@@ -336,17 +351,92 @@
         <w:bidi w:val="0"/>
         <w:rPr>
           <w:rFonts w:hint="default"/>
-          <w:lang w:val="en-US"/>
-        </w:rPr>
-      </w:pPr>
-      <w:r>
-        <w:rPr>
-          <w:rFonts w:hint="default"/>
+          <w:sz w:val="22"/>
+          <w:szCs w:val="22"/>
           <w:vertAlign w:val="baseline"/>
           <w:lang w:val="en-US"/>
         </w:rPr>
+      </w:pPr>
+      <w:r>
+        <w:rPr>
+          <w:rFonts w:hint="default"/>
+          <w:sz w:val="22"/>
+          <w:szCs w:val="22"/>
+          <w:vertAlign w:val="baseline"/>
+          <w:lang w:val="en-US"/>
+        </w:rPr>
         <w:t>ros2 launch jetbot_mirea_description gazebo.launch.py</w:t>
       </w:r>
+      <w:r>
+        <w:rPr>
+          <w:rFonts w:hint="default"/>
+          <w:sz w:val="22"/>
+          <w:szCs w:val="22"/>
+          <w:vertAlign w:val="baseline"/>
+          <w:lang w:val="ru-RU"/>
+        </w:rPr>
+        <w:t xml:space="preserve"> </w:t>
+      </w:r>
+      <w:r>
+        <w:rPr>
+          <w:rFonts w:hint="default"/>
+          <w:sz w:val="22"/>
+          <w:szCs w:val="22"/>
+          <w:vertAlign w:val="baseline"/>
+          <w:lang w:val="en-US"/>
+        </w:rPr>
+        <w:t>\</w:t>
+      </w:r>
+    </w:p>
+    <w:p>
+      <w:pPr>
+        <w:pStyle w:val="20"/>
+        <w:bidi w:val="0"/>
+        <w:rPr>
+          <w:rFonts w:hint="default"/>
+          <w:sz w:val="22"/>
+          <w:szCs w:val="22"/>
+          <w:lang w:val="en-US"/>
+        </w:rPr>
+      </w:pPr>
+      <w:r>
+        <w:rPr>
+          <w:rFonts w:hint="default"/>
+          <w:sz w:val="22"/>
+          <w:szCs w:val="22"/>
+          <w:vertAlign w:val="baseline"/>
+          <w:lang w:val="en-US"/>
+        </w:rPr>
+        <w:t>preset_id:=</w:t>
+      </w:r>
+      <w:r>
+        <w:rPr>
+          <w:rFonts w:hint="default"/>
+          <w:sz w:val="22"/>
+          <w:szCs w:val="22"/>
+          <w:lang w:val="ru-RU"/>
+        </w:rPr>
+        <w:t>'</w:t>
+      </w:r>
+      <w:r>
+        <w:rPr>
+          <w:rFonts w:hint="default"/>
+          <w:sz w:val="22"/>
+          <w:szCs w:val="22"/>
+          <w:vertAlign w:val="baseline"/>
+          <w:lang w:val="en-US"/>
+        </w:rPr>
+        <w:t>sensors_2</w:t>
+      </w:r>
+      <w:r>
+        <w:rPr>
+          <w:rFonts w:hint="default"/>
+          <w:sz w:val="22"/>
+          <w:szCs w:val="22"/>
+          <w:lang w:val="ru-RU"/>
+        </w:rPr>
+        <w:t>'</w:t>
+      </w:r>
     </w:p>
     <w:p>
       <w:pPr>
@@ -354,7 +444,7 @@
         <w:ind w:left="0" w:leftChars="0" w:firstLine="720" w:firstLineChars="0"/>
         <w:rPr>
           <w:rFonts w:hint="default"/>
-          <w:lang w:val="ru-RU"/>
+          <w:lang w:val="en-US"/>
         </w:rPr>
       </w:pPr>
       <w:r>
@@ -415,23 +505,6 @@
           <w:lang w:val="ru-RU"/>
         </w:rPr>
         <w:t xml:space="preserve"> – трёхмерный мир с моделью робота (рисунок 2).</w:t>
-      </w:r>
-    </w:p>
-    <w:p>
-      <w:pPr>
-        <w:bidi w:val="0"/>
-        <w:ind w:left="0" w:leftChars="0" w:firstLine="0" w:firstLineChars="0"/>
-        <w:rPr>
-          <w:rFonts w:hint="default"/>
-          <w:lang w:val="ru-RU"/>
-        </w:rPr>
-      </w:pPr>
-      <w:r>
-        <w:rPr>
-          <w:rFonts w:hint="default"/>
-          <w:lang w:val="ru-RU"/>
-        </w:rPr>
-        <w:t xml:space="preserve"> </w:t>
       </w:r>
     </w:p>
     <w:p>
@@ -498,15 +571,11 @@
         </w:rPr>
       </w:pPr>
       <w:r>
-        <w:rPr>
-          <w:rFonts w:hint="default"/>
-          <w:lang w:val="ru-RU"/>
-        </w:rPr>
         <w:drawing>
           <wp:inline distT="0" distB="0" distL="114300" distR="114300">
             <wp:extent cx="5268595" cy="3340735"/>
-            <wp:effectExtent l="0" t="0" r="4445" b="12065"/>
-            <wp:docPr id="1" name="Изображение 1" descr="Screenshot from 2026-02-12 22-10-58"/>
+            <wp:effectExtent l="0" t="0" r="8255" b="12065"/>
+            <wp:docPr id="6" name="Picture 1"/>
             <wp:cNvGraphicFramePr>
               <a:graphicFrameLocks xmlns:a="http://schemas.openxmlformats.org/drawingml/2006/main" noChangeAspect="1"/>
             </wp:cNvGraphicFramePr>
@@ -514,7 +583,7 @@
               <a:graphicData uri="http://schemas.openxmlformats.org/drawingml/2006/picture">
                 <pic:pic xmlns:pic="http://schemas.openxmlformats.org/drawingml/2006/picture">
                   <pic:nvPicPr>
-                    <pic:cNvPr id="1" name="Изображение 1" descr="Screenshot from 2026-02-12 22-10-58"/>
+                    <pic:cNvPr id="6" name="Picture 1"/>
                     <pic:cNvPicPr>
                       <a:picLocks noChangeAspect="1"/>
                     </pic:cNvPicPr>
@@ -533,6 +602,10 @@
                     <a:prstGeom prst="rect">
                       <a:avLst/>
                     </a:prstGeom>
+                    <a:noFill/>
+                    <a:ln>
+                      <a:noFill/>
+                    </a:ln>
                   </pic:spPr>
                 </pic:pic>
               </a:graphicData>
@@ -1154,7 +1227,16 @@
           <w:rFonts w:hint="default"/>
           <w:lang w:val="en-US"/>
         </w:rPr>
-        <w:t>ros2 run teleop_twist_keyboard teleop_twist_keyboard</w:t>
+        <w:t>ros2 run teleop_twist_keyboard teleop_twi</w:t>
+      </w:r>
+      <w:bookmarkStart w:id="1" w:name="_GoBack"/>
+      <w:bookmarkEnd w:id="1"/>
+      <w:r>
+        <w:rPr>
+          <w:rFonts w:hint="default"/>
+          <w:lang w:val="en-US"/>
+        </w:rPr>
+        <w:t>st_keyboard</w:t>
       </w:r>
     </w:p>
     <w:p>
@@ -1401,6 +1483,7 @@
     <w:p>
       <w:pPr>
         <w:numPr>
+          <w:ilvl w:val="0"/>
           <w:numId w:val="0"/>
         </w:numPr>
         <w:bidi w:val="0"/>
@@ -1431,6 +1514,7 @@
     <w:p>
       <w:pPr>
         <w:numPr>
+          <w:ilvl w:val="0"/>
           <w:numId w:val="0"/>
         </w:numPr>
         <w:bidi w:val="0"/>
@@ -1447,8 +1531,6 @@
         </w:rPr>
         <w:t>После того как базовая симуляция работает, можно переходить к более сложным сценариям:</w:t>
       </w:r>
-      <w:bookmarkStart w:id="1" w:name="_GoBack"/>
-      <w:bookmarkEnd w:id="1"/>
     </w:p>
     <w:p>
       <w:pPr>
@@ -1547,6 +1629,7 @@
     <w:p>
       <w:pPr>
         <w:numPr>
+          <w:ilvl w:val="0"/>
           <w:numId w:val="0"/>
         </w:numPr>
         <w:bidi w:val="0"/>
@@ -1560,6 +1643,7 @@
     <w:p>
       <w:pPr>
         <w:numPr>
+          <w:ilvl w:val="0"/>
           <w:numId w:val="0"/>
         </w:numPr>
         <w:bidi w:val="0"/>

</xml_diff>